<commit_message>
adding all the data to new branch
</commit_message>
<xml_diff>
--- a/Research Paper/Details of Project/GraphRAG_Implementation.docx
+++ b/Research Paper/Details of Project/GraphRAG_Implementation.docx
@@ -4501,13 +4501,8 @@
         <w:spacing w:before="60" w:after="100"/>
       </w:pPr>
       <w:r>
-        <w:t>├── docker-</w:t>
-      </w:r>
-      <w:proofErr w:type="spellStart"/>
-      <w:r>
-        <w:t>compose.prod.yml</w:t>
-      </w:r>
-      <w:proofErr w:type="spellEnd"/>
+        <w:t>├── docker-compose.prod.yml</w:t>
+      </w:r>
     </w:p>
     <w:p>
       <w:pPr>
@@ -8357,15 +8352,7 @@
         <w:spacing w:after="200"/>
       </w:pPr>
       <w:r>
-        <w:t>docker-</w:t>
-      </w:r>
-      <w:proofErr w:type="spellStart"/>
-      <w:r>
-        <w:t>compose.prod.yml</w:t>
-      </w:r>
-      <w:proofErr w:type="spellEnd"/>
-      <w:r>
-        <w:t xml:space="preserve">      # NEW: production compose with nginx reverse proxy</w:t>
+        <w:t>docker-compose.prod.yml      # NEW: production compose with nginx reverse proxy</w:t>
       </w:r>
     </w:p>
     <w:p>
@@ -8499,15 +8486,7 @@
         <w:spacing w:after="200"/>
       </w:pPr>
       <w:r>
-        <w:t xml:space="preserve">  make docker-prod           # docker-compose -f docker-</w:t>
-      </w:r>
-      <w:proofErr w:type="spellStart"/>
-      <w:r>
-        <w:t>compose.prod.yml</w:t>
-      </w:r>
-      <w:proofErr w:type="spellEnd"/>
-      <w:r>
-        <w:t xml:space="preserve"> up</w:t>
+        <w:t xml:space="preserve">  make docker-prod           # docker-compose -f docker-compose.prod.yml up</w:t>
       </w:r>
     </w:p>
     <w:p>
@@ -12334,15 +12313,7 @@
         <w:spacing w:after="200"/>
       </w:pPr>
       <w:r>
-        <w:t>docker-</w:t>
-      </w:r>
-      <w:proofErr w:type="spellStart"/>
-      <w:r>
-        <w:t>compose.prod.yml</w:t>
-      </w:r>
-      <w:proofErr w:type="spellEnd"/>
-      <w:r>
-        <w:t xml:space="preserve">      # backend (</w:t>
+        <w:t>docker-compose.prod.yml      # backend (</w:t>
       </w:r>
       <w:proofErr w:type="spellStart"/>
       <w:r>

</xml_diff>